<commit_message>
Update resume with new portfolio link
Co-Authored-By: Claude Sonnet 5.5 <noreply@anthropic.com>
Claude-Session: https://claude.ai/code/session_019ukDqW5in4EvVKyJ8fhwtw
</commit_message>
<xml_diff>
--- a/Morteza_PourHosseini_Resume.docx
+++ b/Morteza_PourHosseini_Resume.docx
@@ -52,7 +52,7 @@
       <w:pPr>
         <w:spacing w:after="40"/>
       </w:pPr>
-      <w:hyperlink w:history="1" r:id="rIdfokprhtzh_hge3qu-mll3">
+      <w:hyperlink w:history="1" r:id="rId5bjvdhaxvhpiwn86tw8-h">
         <w:r>
           <w:rPr>
             <w:rFonts w:ascii="Calibri" w:cs="Calibri" w:eastAsia="Calibri" w:hAnsi="Calibri"/>
@@ -72,7 +72,7 @@
         </w:rPr>
         <w:t xml:space="preserve">    </w:t>
       </w:r>
-      <w:hyperlink w:history="1" r:id="rId9exnhqb8oquurb8aso-ju">
+      <w:hyperlink w:history="1" r:id="rIdqe_72eenyidil3xst-gj5">
         <w:r>
           <w:rPr>
             <w:rFonts w:ascii="Calibri" w:cs="Calibri" w:eastAsia="Calibri" w:hAnsi="Calibri"/>
@@ -92,7 +92,7 @@
         </w:rPr>
         <w:t xml:space="preserve">    </w:t>
       </w:r>
-      <w:hyperlink w:history="1" r:id="rIdjvk4_7yylwf-dmwq4pncr">
+      <w:hyperlink w:history="1" r:id="rId8s9iswmidaprjhxk-mhe7">
         <w:r>
           <w:rPr>
             <w:rFonts w:ascii="Calibri" w:cs="Calibri" w:eastAsia="Calibri" w:hAnsi="Calibri"/>
@@ -101,7 +101,7 @@
             <w:szCs w:val="19"/>
             <w:u w:val="single"/>
           </w:rPr>
-          <w:t xml:space="preserve">Portfolio ↗</w:t>
+          <w:t xml:space="preserve">mortezapourhoseini.github.io</w:t>
         </w:r>
       </w:hyperlink>
     </w:p>

</xml_diff>

<commit_message>
Resume: blue accent matching portfolio, Arial
Co-Authored-By: Claude Sonnet 5.5 <noreply@anthropic.com>
Claude-Session: https://claude.ai/code/session_019ukDqW5in4EvVKyJ8fhwtw
</commit_message>
<xml_diff>
--- a/Morteza_PourHosseini_Resume.docx
+++ b/Morteza_PourHosseini_Resume.docx
@@ -8,10 +8,10 @@
       </w:pPr>
       <w:r>
         <w:rPr>
-          <w:rFonts w:ascii="Calibri" w:cs="Calibri" w:eastAsia="Calibri" w:hAnsi="Calibri"/>
-          <w:b/>
-          <w:bCs/>
-          <w:color w:val="111111"/>
+          <w:rFonts w:ascii="Arial" w:cs="Arial" w:eastAsia="Arial" w:hAnsi="Arial"/>
+          <w:b/>
+          <w:bCs/>
+          <w:color w:val="101A28"/>
           <w:sz w:val="40"/>
           <w:szCs w:val="40"/>
         </w:rPr>
@@ -24,10 +24,10 @@
       </w:pPr>
       <w:r>
         <w:rPr>
-          <w:rFonts w:ascii="Calibri" w:cs="Calibri" w:eastAsia="Calibri" w:hAnsi="Calibri"/>
-          <w:b/>
-          <w:bCs/>
-          <w:color w:val="0E6E66"/>
+          <w:rFonts w:ascii="Arial" w:cs="Arial" w:eastAsia="Arial" w:hAnsi="Arial"/>
+          <w:b/>
+          <w:bCs/>
+          <w:color w:val="1F4F99"/>
           <w:sz w:val="24"/>
           <w:szCs w:val="24"/>
         </w:rPr>
@@ -40,8 +40,8 @@
       </w:pPr>
       <w:r>
         <w:rPr>
-          <w:rFonts w:ascii="Calibri" w:cs="Calibri" w:eastAsia="Calibri" w:hAnsi="Calibri"/>
-          <w:color w:val="555555"/>
+          <w:rFonts w:ascii="Arial" w:cs="Arial" w:eastAsia="Arial" w:hAnsi="Arial"/>
+          <w:color w:val="566377"/>
           <w:sz w:val="19"/>
           <w:szCs w:val="19"/>
         </w:rPr>
@@ -52,11 +52,11 @@
       <w:pPr>
         <w:spacing w:after="40"/>
       </w:pPr>
-      <w:hyperlink w:history="1" r:id="rId5bjvdhaxvhpiwn86tw8-h">
+      <w:hyperlink w:history="1" r:id="rIdu-be81-sfee7errqyvnw5">
         <w:r>
           <w:rPr>
-            <w:rFonts w:ascii="Calibri" w:cs="Calibri" w:eastAsia="Calibri" w:hAnsi="Calibri"/>
-            <w:color w:val="0E6E66"/>
+            <w:rFonts w:ascii="Arial" w:cs="Arial" w:eastAsia="Arial" w:hAnsi="Arial"/>
+            <w:color w:val="1F4F99"/>
             <w:sz w:val="19"/>
             <w:szCs w:val="19"/>
             <w:u w:val="single"/>
@@ -66,17 +66,17 @@
       </w:hyperlink>
       <w:r>
         <w:rPr>
-          <w:rFonts w:ascii="Calibri" w:cs="Calibri" w:eastAsia="Calibri" w:hAnsi="Calibri"/>
+          <w:rFonts w:ascii="Arial" w:cs="Arial" w:eastAsia="Arial" w:hAnsi="Arial"/>
           <w:sz w:val="19"/>
           <w:szCs w:val="19"/>
         </w:rPr>
         <w:t xml:space="preserve">    </w:t>
       </w:r>
-      <w:hyperlink w:history="1" r:id="rIdqe_72eenyidil3xst-gj5">
+      <w:hyperlink w:history="1" r:id="rIdycy2c4x3fwoyg7kd9sg1q">
         <w:r>
           <w:rPr>
-            <w:rFonts w:ascii="Calibri" w:cs="Calibri" w:eastAsia="Calibri" w:hAnsi="Calibri"/>
-            <w:color w:val="0E6E66"/>
+            <w:rFonts w:ascii="Arial" w:cs="Arial" w:eastAsia="Arial" w:hAnsi="Arial"/>
+            <w:color w:val="1F4F99"/>
             <w:sz w:val="19"/>
             <w:szCs w:val="19"/>
             <w:u w:val="single"/>
@@ -86,17 +86,17 @@
       </w:hyperlink>
       <w:r>
         <w:rPr>
-          <w:rFonts w:ascii="Calibri" w:cs="Calibri" w:eastAsia="Calibri" w:hAnsi="Calibri"/>
+          <w:rFonts w:ascii="Arial" w:cs="Arial" w:eastAsia="Arial" w:hAnsi="Arial"/>
           <w:sz w:val="19"/>
           <w:szCs w:val="19"/>
         </w:rPr>
         <w:t xml:space="preserve">    </w:t>
       </w:r>
-      <w:hyperlink w:history="1" r:id="rId8s9iswmidaprjhxk-mhe7">
+      <w:hyperlink w:history="1" r:id="rIds3mumagmv-itblesc8qjs">
         <w:r>
           <w:rPr>
-            <w:rFonts w:ascii="Calibri" w:cs="Calibri" w:eastAsia="Calibri" w:hAnsi="Calibri"/>
-            <w:color w:val="0E6E66"/>
+            <w:rFonts w:ascii="Arial" w:cs="Arial" w:eastAsia="Arial" w:hAnsi="Arial"/>
+            <w:color w:val="1F4F99"/>
             <w:sz w:val="19"/>
             <w:szCs w:val="19"/>
             <w:u w:val="single"/>
@@ -108,7 +108,7 @@
     <w:p>
       <w:pPr>
         <w:pBdr>
-          <w:bottom w:val="single" w:color="CCCCCC" w:sz="6" w:space="1"/>
+          <w:bottom w:val="single" w:color="D5DCE6" w:sz="6" w:space="1"/>
         </w:pBdr>
         <w:spacing w:after="160" w:before="40"/>
       </w:pPr>
@@ -117,16 +117,16 @@
       <w:pPr>
         <w:pStyle w:val="Heading2"/>
         <w:pBdr>
-          <w:bottom w:val="single" w:color="0E6E66" w:sz="8" w:space="2"/>
+          <w:bottom w:val="single" w:color="1F4F99" w:sz="8" w:space="2"/>
         </w:pBdr>
         <w:spacing w:after="60" w:before="150"/>
       </w:pPr>
       <w:r>
         <w:rPr>
-          <w:rFonts w:ascii="Calibri" w:cs="Calibri" w:eastAsia="Calibri" w:hAnsi="Calibri"/>
-          <w:b/>
-          <w:bCs/>
-          <w:color w:val="0E6E66"/>
+          <w:rFonts w:ascii="Arial" w:cs="Arial" w:eastAsia="Arial" w:hAnsi="Arial"/>
+          <w:b/>
+          <w:bCs/>
+          <w:color w:val="1F4F99"/>
           <w:spacing w:val="10"/>
           <w:sz w:val="21"/>
           <w:szCs w:val="21"/>
@@ -140,7 +140,7 @@
       </w:pPr>
       <w:r>
         <w:rPr>
-          <w:rFonts w:ascii="Calibri" w:cs="Calibri" w:eastAsia="Calibri" w:hAnsi="Calibri"/>
+          <w:rFonts w:ascii="Arial" w:cs="Arial" w:eastAsia="Arial" w:hAnsi="Arial"/>
           <w:sz w:val="21"/>
           <w:szCs w:val="21"/>
         </w:rPr>
@@ -151,16 +151,16 @@
       <w:pPr>
         <w:pStyle w:val="Heading2"/>
         <w:pBdr>
-          <w:bottom w:val="single" w:color="0E6E66" w:sz="8" w:space="2"/>
+          <w:bottom w:val="single" w:color="1F4F99" w:sz="8" w:space="2"/>
         </w:pBdr>
         <w:spacing w:after="60" w:before="150"/>
       </w:pPr>
       <w:r>
         <w:rPr>
-          <w:rFonts w:ascii="Calibri" w:cs="Calibri" w:eastAsia="Calibri" w:hAnsi="Calibri"/>
-          <w:b/>
-          <w:bCs/>
-          <w:color w:val="0E6E66"/>
+          <w:rFonts w:ascii="Arial" w:cs="Arial" w:eastAsia="Arial" w:hAnsi="Arial"/>
+          <w:b/>
+          <w:bCs/>
+          <w:color w:val="1F4F99"/>
           <w:spacing w:val="10"/>
           <w:sz w:val="21"/>
           <w:szCs w:val="21"/>
@@ -174,7 +174,7 @@
       </w:pPr>
       <w:r>
         <w:rPr>
-          <w:rFonts w:ascii="Calibri" w:cs="Calibri" w:eastAsia="Calibri" w:hAnsi="Calibri"/>
+          <w:rFonts w:ascii="Arial" w:cs="Arial" w:eastAsia="Arial" w:hAnsi="Arial"/>
           <w:b/>
           <w:bCs/>
           <w:sz w:val="20"/>
@@ -184,7 +184,7 @@
       </w:r>
       <w:r>
         <w:rPr>
-          <w:rFonts w:ascii="Calibri" w:cs="Calibri" w:eastAsia="Calibri" w:hAnsi="Calibri"/>
+          <w:rFonts w:ascii="Arial" w:cs="Arial" w:eastAsia="Arial" w:hAnsi="Arial"/>
           <w:sz w:val="20"/>
           <w:szCs w:val="20"/>
         </w:rPr>
@@ -197,7 +197,7 @@
       </w:pPr>
       <w:r>
         <w:rPr>
-          <w:rFonts w:ascii="Calibri" w:cs="Calibri" w:eastAsia="Calibri" w:hAnsi="Calibri"/>
+          <w:rFonts w:ascii="Arial" w:cs="Arial" w:eastAsia="Arial" w:hAnsi="Arial"/>
           <w:b/>
           <w:bCs/>
           <w:sz w:val="20"/>
@@ -207,7 +207,7 @@
       </w:r>
       <w:r>
         <w:rPr>
-          <w:rFonts w:ascii="Calibri" w:cs="Calibri" w:eastAsia="Calibri" w:hAnsi="Calibri"/>
+          <w:rFonts w:ascii="Arial" w:cs="Arial" w:eastAsia="Arial" w:hAnsi="Arial"/>
           <w:sz w:val="20"/>
           <w:szCs w:val="20"/>
         </w:rPr>
@@ -220,7 +220,7 @@
       </w:pPr>
       <w:r>
         <w:rPr>
-          <w:rFonts w:ascii="Calibri" w:cs="Calibri" w:eastAsia="Calibri" w:hAnsi="Calibri"/>
+          <w:rFonts w:ascii="Arial" w:cs="Arial" w:eastAsia="Arial" w:hAnsi="Arial"/>
           <w:b/>
           <w:bCs/>
           <w:sz w:val="20"/>
@@ -230,7 +230,7 @@
       </w:r>
       <w:r>
         <w:rPr>
-          <w:rFonts w:ascii="Calibri" w:cs="Calibri" w:eastAsia="Calibri" w:hAnsi="Calibri"/>
+          <w:rFonts w:ascii="Arial" w:cs="Arial" w:eastAsia="Arial" w:hAnsi="Arial"/>
           <w:sz w:val="20"/>
           <w:szCs w:val="20"/>
         </w:rPr>
@@ -241,16 +241,16 @@
       <w:pPr>
         <w:pStyle w:val="Heading2"/>
         <w:pBdr>
-          <w:bottom w:val="single" w:color="0E6E66" w:sz="8" w:space="2"/>
+          <w:bottom w:val="single" w:color="1F4F99" w:sz="8" w:space="2"/>
         </w:pBdr>
         <w:spacing w:after="60" w:before="150"/>
       </w:pPr>
       <w:r>
         <w:rPr>
-          <w:rFonts w:ascii="Calibri" w:cs="Calibri" w:eastAsia="Calibri" w:hAnsi="Calibri"/>
-          <w:b/>
-          <w:bCs/>
-          <w:color w:val="0E6E66"/>
+          <w:rFonts w:ascii="Arial" w:cs="Arial" w:eastAsia="Arial" w:hAnsi="Arial"/>
+          <w:b/>
+          <w:bCs/>
+          <w:color w:val="1F4F99"/>
           <w:spacing w:val="10"/>
           <w:sz w:val="21"/>
           <w:szCs w:val="21"/>
@@ -264,7 +264,7 @@
       </w:pPr>
       <w:r>
         <w:rPr>
-          <w:rFonts w:ascii="Calibri" w:cs="Calibri" w:eastAsia="Calibri" w:hAnsi="Calibri"/>
+          <w:rFonts w:ascii="Arial" w:cs="Arial" w:eastAsia="Arial" w:hAnsi="Arial"/>
           <w:b/>
           <w:bCs/>
           <w:sz w:val="22"/>
@@ -274,7 +274,7 @@
       </w:r>
       <w:r>
         <w:rPr>
-          <w:rFonts w:ascii="Calibri" w:cs="Calibri" w:eastAsia="Calibri" w:hAnsi="Calibri"/>
+          <w:rFonts w:ascii="Arial" w:cs="Arial" w:eastAsia="Arial" w:hAnsi="Arial"/>
           <w:sz w:val="22"/>
           <w:szCs w:val="22"/>
         </w:rPr>
@@ -287,10 +287,10 @@
       </w:pPr>
       <w:r>
         <w:rPr>
-          <w:rFonts w:ascii="Calibri" w:cs="Calibri" w:eastAsia="Calibri" w:hAnsi="Calibri"/>
+          <w:rFonts w:ascii="Arial" w:cs="Arial" w:eastAsia="Arial" w:hAnsi="Arial"/>
           <w:i/>
           <w:iCs/>
-          <w:color w:val="555555"/>
+          <w:color w:val="566377"/>
           <w:sz w:val="19"/>
           <w:szCs w:val="19"/>
         </w:rPr>
@@ -308,7 +308,7 @@
       </w:pPr>
       <w:r>
         <w:rPr>
-          <w:rFonts w:ascii="Calibri" w:cs="Calibri" w:eastAsia="Calibri" w:hAnsi="Calibri"/>
+          <w:rFonts w:ascii="Arial" w:cs="Arial" w:eastAsia="Arial" w:hAnsi="Arial"/>
           <w:sz w:val="21"/>
           <w:szCs w:val="21"/>
         </w:rPr>
@@ -326,7 +326,7 @@
       </w:pPr>
       <w:r>
         <w:rPr>
-          <w:rFonts w:ascii="Calibri" w:cs="Calibri" w:eastAsia="Calibri" w:hAnsi="Calibri"/>
+          <w:rFonts w:ascii="Arial" w:cs="Arial" w:eastAsia="Arial" w:hAnsi="Arial"/>
           <w:sz w:val="21"/>
           <w:szCs w:val="21"/>
         </w:rPr>
@@ -337,16 +337,16 @@
       <w:pPr>
         <w:pStyle w:val="Heading2"/>
         <w:pBdr>
-          <w:bottom w:val="single" w:color="0E6E66" w:sz="8" w:space="2"/>
+          <w:bottom w:val="single" w:color="1F4F99" w:sz="8" w:space="2"/>
         </w:pBdr>
         <w:spacing w:after="60" w:before="150"/>
       </w:pPr>
       <w:r>
         <w:rPr>
-          <w:rFonts w:ascii="Calibri" w:cs="Calibri" w:eastAsia="Calibri" w:hAnsi="Calibri"/>
-          <w:b/>
-          <w:bCs/>
-          <w:color w:val="0E6E66"/>
+          <w:rFonts w:ascii="Arial" w:cs="Arial" w:eastAsia="Arial" w:hAnsi="Arial"/>
+          <w:b/>
+          <w:bCs/>
+          <w:color w:val="1F4F99"/>
           <w:spacing w:val="10"/>
           <w:sz w:val="21"/>
           <w:szCs w:val="21"/>
@@ -360,7 +360,7 @@
       </w:pPr>
       <w:r>
         <w:rPr>
-          <w:rFonts w:ascii="Calibri" w:cs="Calibri" w:eastAsia="Calibri" w:hAnsi="Calibri"/>
+          <w:rFonts w:ascii="Arial" w:cs="Arial" w:eastAsia="Arial" w:hAnsi="Arial"/>
           <w:b/>
           <w:bCs/>
           <w:sz w:val="22"/>
@@ -380,7 +380,7 @@
       </w:pPr>
       <w:r>
         <w:rPr>
-          <w:rFonts w:ascii="Calibri" w:cs="Calibri" w:eastAsia="Calibri" w:hAnsi="Calibri"/>
+          <w:rFonts w:ascii="Arial" w:cs="Arial" w:eastAsia="Arial" w:hAnsi="Arial"/>
           <w:sz w:val="21"/>
           <w:szCs w:val="21"/>
         </w:rPr>
@@ -398,7 +398,7 @@
       </w:pPr>
       <w:r>
         <w:rPr>
-          <w:rFonts w:ascii="Calibri" w:cs="Calibri" w:eastAsia="Calibri" w:hAnsi="Calibri"/>
+          <w:rFonts w:ascii="Arial" w:cs="Arial" w:eastAsia="Arial" w:hAnsi="Arial"/>
           <w:sz w:val="21"/>
           <w:szCs w:val="21"/>
         </w:rPr>
@@ -411,7 +411,7 @@
       </w:pPr>
       <w:r>
         <w:rPr>
-          <w:rFonts w:ascii="Calibri" w:cs="Calibri" w:eastAsia="Calibri" w:hAnsi="Calibri"/>
+          <w:rFonts w:ascii="Arial" w:cs="Arial" w:eastAsia="Arial" w:hAnsi="Arial"/>
           <w:b/>
           <w:bCs/>
           <w:sz w:val="22"/>
@@ -431,7 +431,7 @@
       </w:pPr>
       <w:r>
         <w:rPr>
-          <w:rFonts w:ascii="Calibri" w:cs="Calibri" w:eastAsia="Calibri" w:hAnsi="Calibri"/>
+          <w:rFonts w:ascii="Arial" w:cs="Arial" w:eastAsia="Arial" w:hAnsi="Arial"/>
           <w:sz w:val="21"/>
           <w:szCs w:val="21"/>
         </w:rPr>
@@ -444,7 +444,7 @@
       </w:pPr>
       <w:r>
         <w:rPr>
-          <w:rFonts w:ascii="Calibri" w:cs="Calibri" w:eastAsia="Calibri" w:hAnsi="Calibri"/>
+          <w:rFonts w:ascii="Arial" w:cs="Arial" w:eastAsia="Arial" w:hAnsi="Arial"/>
           <w:b/>
           <w:bCs/>
           <w:sz w:val="22"/>
@@ -464,7 +464,7 @@
       </w:pPr>
       <w:r>
         <w:rPr>
-          <w:rFonts w:ascii="Calibri" w:cs="Calibri" w:eastAsia="Calibri" w:hAnsi="Calibri"/>
+          <w:rFonts w:ascii="Arial" w:cs="Arial" w:eastAsia="Arial" w:hAnsi="Arial"/>
           <w:sz w:val="21"/>
           <w:szCs w:val="21"/>
         </w:rPr>
@@ -477,10 +477,10 @@
       </w:pPr>
       <w:r>
         <w:rPr>
-          <w:rFonts w:ascii="Calibri" w:cs="Calibri" w:eastAsia="Calibri" w:hAnsi="Calibri"/>
+          <w:rFonts w:ascii="Arial" w:cs="Arial" w:eastAsia="Arial" w:hAnsi="Arial"/>
           <w:i/>
           <w:iCs/>
-          <w:color w:val="555555"/>
+          <w:color w:val="566377"/>
           <w:sz w:val="19"/>
           <w:szCs w:val="19"/>
         </w:rPr>
@@ -491,16 +491,16 @@
       <w:pPr>
         <w:pStyle w:val="Heading2"/>
         <w:pBdr>
-          <w:bottom w:val="single" w:color="0E6E66" w:sz="8" w:space="2"/>
+          <w:bottom w:val="single" w:color="1F4F99" w:sz="8" w:space="2"/>
         </w:pBdr>
         <w:spacing w:after="60" w:before="150"/>
       </w:pPr>
       <w:r>
         <w:rPr>
-          <w:rFonts w:ascii="Calibri" w:cs="Calibri" w:eastAsia="Calibri" w:hAnsi="Calibri"/>
-          <w:b/>
-          <w:bCs/>
-          <w:color w:val="0E6E66"/>
+          <w:rFonts w:ascii="Arial" w:cs="Arial" w:eastAsia="Arial" w:hAnsi="Arial"/>
+          <w:b/>
+          <w:bCs/>
+          <w:color w:val="1F4F99"/>
           <w:spacing w:val="10"/>
           <w:sz w:val="21"/>
           <w:szCs w:val="21"/>
@@ -514,7 +514,7 @@
       </w:pPr>
       <w:r>
         <w:rPr>
-          <w:rFonts w:ascii="Calibri" w:cs="Calibri" w:eastAsia="Calibri" w:hAnsi="Calibri"/>
+          <w:rFonts w:ascii="Arial" w:cs="Arial" w:eastAsia="Arial" w:hAnsi="Arial"/>
           <w:b/>
           <w:bCs/>
           <w:sz w:val="22"/>
@@ -524,7 +524,7 @@
       </w:r>
       <w:r>
         <w:rPr>
-          <w:rFonts w:ascii="Calibri" w:cs="Calibri" w:eastAsia="Calibri" w:hAnsi="Calibri"/>
+          <w:rFonts w:ascii="Arial" w:cs="Arial" w:eastAsia="Arial" w:hAnsi="Arial"/>
           <w:sz w:val="22"/>
           <w:szCs w:val="22"/>
         </w:rPr>
@@ -537,10 +537,10 @@
       </w:pPr>
       <w:r>
         <w:rPr>
-          <w:rFonts w:ascii="Calibri" w:cs="Calibri" w:eastAsia="Calibri" w:hAnsi="Calibri"/>
+          <w:rFonts w:ascii="Arial" w:cs="Arial" w:eastAsia="Arial" w:hAnsi="Arial"/>
           <w:i/>
           <w:iCs/>
-          <w:color w:val="555555"/>
+          <w:color w:val="566377"/>
           <w:sz w:val="19"/>
           <w:szCs w:val="19"/>
         </w:rPr>
@@ -553,7 +553,7 @@
       </w:pPr>
       <w:r>
         <w:rPr>
-          <w:rFonts w:ascii="Calibri" w:cs="Calibri" w:eastAsia="Calibri" w:hAnsi="Calibri"/>
+          <w:rFonts w:ascii="Arial" w:cs="Arial" w:eastAsia="Arial" w:hAnsi="Arial"/>
           <w:b/>
           <w:bCs/>
           <w:sz w:val="22"/>
@@ -563,7 +563,7 @@
       </w:r>
       <w:r>
         <w:rPr>
-          <w:rFonts w:ascii="Calibri" w:cs="Calibri" w:eastAsia="Calibri" w:hAnsi="Calibri"/>
+          <w:rFonts w:ascii="Arial" w:cs="Arial" w:eastAsia="Arial" w:hAnsi="Arial"/>
           <w:sz w:val="22"/>
           <w:szCs w:val="22"/>
         </w:rPr>
@@ -576,10 +576,10 @@
       </w:pPr>
       <w:r>
         <w:rPr>
-          <w:rFonts w:ascii="Calibri" w:cs="Calibri" w:eastAsia="Calibri" w:hAnsi="Calibri"/>
+          <w:rFonts w:ascii="Arial" w:cs="Arial" w:eastAsia="Arial" w:hAnsi="Arial"/>
           <w:i/>
           <w:iCs/>
-          <w:color w:val="555555"/>
+          <w:color w:val="566377"/>
           <w:sz w:val="19"/>
           <w:szCs w:val="19"/>
         </w:rPr>
@@ -590,16 +590,16 @@
       <w:pPr>
         <w:pStyle w:val="Heading2"/>
         <w:pBdr>
-          <w:bottom w:val="single" w:color="0E6E66" w:sz="8" w:space="2"/>
+          <w:bottom w:val="single" w:color="1F4F99" w:sz="8" w:space="2"/>
         </w:pBdr>
         <w:spacing w:after="60" w:before="150"/>
       </w:pPr>
       <w:r>
         <w:rPr>
-          <w:rFonts w:ascii="Calibri" w:cs="Calibri" w:eastAsia="Calibri" w:hAnsi="Calibri"/>
-          <w:b/>
-          <w:bCs/>
-          <w:color w:val="0E6E66"/>
+          <w:rFonts w:ascii="Arial" w:cs="Arial" w:eastAsia="Arial" w:hAnsi="Arial"/>
+          <w:b/>
+          <w:bCs/>
+          <w:color w:val="1F4F99"/>
           <w:spacing w:val="10"/>
           <w:sz w:val="21"/>
           <w:szCs w:val="21"/>
@@ -618,7 +618,7 @@
       </w:pPr>
       <w:r>
         <w:rPr>
-          <w:rFonts w:ascii="Calibri" w:cs="Calibri" w:eastAsia="Calibri" w:hAnsi="Calibri"/>
+          <w:rFonts w:ascii="Arial" w:cs="Arial" w:eastAsia="Arial" w:hAnsi="Arial"/>
           <w:sz w:val="21"/>
           <w:szCs w:val="21"/>
         </w:rPr>
@@ -636,7 +636,7 @@
       </w:pPr>
       <w:r>
         <w:rPr>
-          <w:rFonts w:ascii="Calibri" w:cs="Calibri" w:eastAsia="Calibri" w:hAnsi="Calibri"/>
+          <w:rFonts w:ascii="Arial" w:cs="Arial" w:eastAsia="Arial" w:hAnsi="Arial"/>
           <w:sz w:val="21"/>
           <w:szCs w:val="21"/>
         </w:rPr>
@@ -654,7 +654,7 @@
       </w:pPr>
       <w:r>
         <w:rPr>
-          <w:rFonts w:ascii="Calibri" w:cs="Calibri" w:eastAsia="Calibri" w:hAnsi="Calibri"/>
+          <w:rFonts w:ascii="Arial" w:cs="Arial" w:eastAsia="Arial" w:hAnsi="Arial"/>
           <w:sz w:val="21"/>
           <w:szCs w:val="21"/>
         </w:rPr>
@@ -665,16 +665,16 @@
       <w:pPr>
         <w:pStyle w:val="Heading2"/>
         <w:pBdr>
-          <w:bottom w:val="single" w:color="0E6E66" w:sz="8" w:space="2"/>
+          <w:bottom w:val="single" w:color="1F4F99" w:sz="8" w:space="2"/>
         </w:pBdr>
         <w:spacing w:after="60" w:before="150"/>
       </w:pPr>
       <w:r>
         <w:rPr>
-          <w:rFonts w:ascii="Calibri" w:cs="Calibri" w:eastAsia="Calibri" w:hAnsi="Calibri"/>
-          <w:b/>
-          <w:bCs/>
-          <w:color w:val="0E6E66"/>
+          <w:rFonts w:ascii="Arial" w:cs="Arial" w:eastAsia="Arial" w:hAnsi="Arial"/>
+          <w:b/>
+          <w:bCs/>
+          <w:color w:val="1F4F99"/>
           <w:spacing w:val="10"/>
           <w:sz w:val="21"/>
           <w:szCs w:val="21"/>
@@ -688,7 +688,7 @@
       </w:pPr>
       <w:r>
         <w:rPr>
-          <w:rFonts w:ascii="Calibri" w:cs="Calibri" w:eastAsia="Calibri" w:hAnsi="Calibri"/>
+          <w:rFonts w:ascii="Arial" w:cs="Arial" w:eastAsia="Arial" w:hAnsi="Arial"/>
           <w:sz w:val="21"/>
           <w:szCs w:val="21"/>
         </w:rPr>

</xml_diff>

<commit_message>
Portfolio and resume: link brain tumor segmentation repo
Co-Authored-By: Claude Sonnet 5.5 <noreply@anthropic.com>
Claude-Session: https://claude.ai/code/session_019ukDqW5in4EvVKyJ8fhwtw
</commit_message>
<xml_diff>
--- a/Morteza_PourHosseini_Resume.docx
+++ b/Morteza_PourHosseini_Resume.docx
@@ -52,7 +52,7 @@
       <w:pPr>
         <w:spacing w:after="40"/>
       </w:pPr>
-      <w:hyperlink w:history="1" r:id="rIdu-be81-sfee7errqyvnw5">
+      <w:hyperlink w:history="1" r:id="rIdaynrw8-gyckjheexwk3ww">
         <w:r>
           <w:rPr>
             <w:rFonts w:ascii="Arial" w:cs="Arial" w:eastAsia="Arial" w:hAnsi="Arial"/>
@@ -72,7 +72,7 @@
         </w:rPr>
         <w:t xml:space="preserve">    </w:t>
       </w:r>
-      <w:hyperlink w:history="1" r:id="rIdycy2c4x3fwoyg7kd9sg1q">
+      <w:hyperlink w:history="1" r:id="rIdlmdnf2pcxerkpe3kpdqgh">
         <w:r>
           <w:rPr>
             <w:rFonts w:ascii="Arial" w:cs="Arial" w:eastAsia="Arial" w:hAnsi="Arial"/>
@@ -92,7 +92,7 @@
         </w:rPr>
         <w:t xml:space="preserve">    </w:t>
       </w:r>
-      <w:hyperlink w:history="1" r:id="rIds3mumagmv-itblesc8qjs">
+      <w:hyperlink w:history="1" r:id="rIdq_of21hyopm7ygbqzgrmm">
         <w:r>
           <w:rPr>
             <w:rFonts w:ascii="Arial" w:cs="Arial" w:eastAsia="Arial" w:hAnsi="Arial"/>
@@ -417,7 +417,7 @@
           <w:sz w:val="22"/>
           <w:szCs w:val="22"/>
         </w:rPr>
-        <w:t xml:space="preserve">Brain Tumor Segmentation</w:t>
+        <w:t xml:space="preserve">Morphology-based Brain Tumor Segmentation</w:t>
       </w:r>
     </w:p>
     <w:p>
@@ -435,8 +435,25 @@
           <w:sz w:val="21"/>
           <w:szCs w:val="21"/>
         </w:rPr>
-        <w:t xml:space="preserve">Designed a segmentation pipeline using classical morphological operations to isolate brain tissue from surrounding bone before tumor localization — no deep model required.</w:t>
-      </w:r>
+        <w:t xml:space="preserve">Segmented tumors in FLAIR MRI using only classical morphology: top-hat filtering to remove the skull, then thresholding and connected-component analysis. No deep model required.</w:t>
+      </w:r>
+    </w:p>
+    <w:p>
+      <w:pPr>
+        <w:spacing w:after="60"/>
+      </w:pPr>
+      <w:hyperlink w:history="1" r:id="rIdnoo0ytyhymxv9dhtz5ven">
+        <w:r>
+          <w:rPr>
+            <w:rFonts w:ascii="Arial" w:cs="Arial" w:eastAsia="Arial" w:hAnsi="Arial"/>
+            <w:color w:val="1F4F99"/>
+            <w:sz w:val="19"/>
+            <w:szCs w:val="19"/>
+            <w:u w:val="single"/>
+          </w:rPr>
+          <w:t xml:space="preserve">github.com/mortezapourhoseini/Morphology_based_Brain_Tumor_segmentation</w:t>
+        </w:r>
+      </w:hyperlink>
     </w:p>
     <w:p>
       <w:pPr>

</xml_diff>

<commit_message>
Résumé and portfolio: add ESP32-S3 smart sensors experience bullets
Co-Authored-By: Claude Sonnet 5.5 <noreply@anthropic.com>
Claude-Session: https://claude.ai/code/session_019ukDqW5in4EvVKyJ8fhwtw
</commit_message>
<xml_diff>
--- a/Morteza_PourHosseini_Resume.docx
+++ b/Morteza_PourHosseini_Resume.docx
@@ -52,7 +52,7 @@
       <w:pPr>
         <w:spacing w:after="40"/>
       </w:pPr>
-      <w:hyperlink w:history="1" r:id="rIdaynrw8-gyckjheexwk3ww">
+      <w:hyperlink w:history="1" r:id="rIdbkpy3kreitnzyihq90pnp">
         <w:r>
           <w:rPr>
             <w:rFonts w:ascii="Arial" w:cs="Arial" w:eastAsia="Arial" w:hAnsi="Arial"/>
@@ -72,7 +72,7 @@
         </w:rPr>
         <w:t xml:space="preserve">    </w:t>
       </w:r>
-      <w:hyperlink w:history="1" r:id="rIdlmdnf2pcxerkpe3kpdqgh">
+      <w:hyperlink w:history="1" r:id="rIdpxkyftcrvj__texlgmsj5">
         <w:r>
           <w:rPr>
             <w:rFonts w:ascii="Arial" w:cs="Arial" w:eastAsia="Arial" w:hAnsi="Arial"/>
@@ -92,7 +92,7 @@
         </w:rPr>
         <w:t xml:space="preserve">    </w:t>
       </w:r>
-      <w:hyperlink w:history="1" r:id="rIdq_of21hyopm7ygbqzgrmm">
+      <w:hyperlink w:history="1" r:id="rIdzbs6ri9ys-qaoc7fo9m34">
         <w:r>
           <w:rPr>
             <w:rFonts w:ascii="Arial" w:cs="Arial" w:eastAsia="Arial" w:hAnsi="Arial"/>
@@ -144,7 +144,7 @@
           <w:sz w:val="21"/>
           <w:szCs w:val="21"/>
         </w:rPr>
-        <w:t xml:space="preserve">Computer engineering graduate (GPA 18.32/20) and M.Sc. student in Computer Systems Architecture at Tarbiat Modares University, focused on embedded and edge AI systems and computer vision. 12 months of hands-on edge/IoT development, plus real-time detection and segmentation projects on Raspberry Pi and microcontrollers. Available part-time with flexible hours alongside graduate studies; open to remote and freelance work.</w:t>
+        <w:t xml:space="preserve">Computer engineering graduate (GPA 18.32/20) and M.Sc. student in Computer Systems Architecture at Tarbiat Modares University, focused on embedded and edge AI systems and computer vision. 12 months of hands-on edge/IoT development, plus real-time vision projects on Raspberry Pi. Available part-time with flexible hours alongside graduate studies; open to remote and freelance work.</w:t>
       </w:r>
     </w:p>
     <w:p>
@@ -312,7 +312,7 @@
           <w:sz w:val="21"/>
           <w:szCs w:val="21"/>
         </w:rPr>
-        <w:t xml:space="preserve">Worked as an edge-computing developer on two projects spanning Industrial IoT and Smart Home systems.</w:t>
+        <w:t xml:space="preserve">Worked on two Industrial IoT and Smart Home projects: Python back-end programming and UML system design.</w:t>
       </w:r>
     </w:p>
     <w:p>
@@ -330,43 +330,7 @@
           <w:sz w:val="21"/>
           <w:szCs w:val="21"/>
         </w:rPr>
-        <w:t xml:space="preserve">Contributed to back-end programming and system analysis and design, applying Python and UML.</w:t>
-      </w:r>
-    </w:p>
-    <w:p>
-      <w:pPr>
-        <w:pStyle w:val="Heading2"/>
-        <w:pBdr>
-          <w:bottom w:val="single" w:color="1F4F99" w:sz="8" w:space="2"/>
-        </w:pBdr>
-        <w:spacing w:after="60" w:before="150"/>
-      </w:pPr>
-      <w:r>
-        <w:rPr>
-          <w:rFonts w:ascii="Arial" w:cs="Arial" w:eastAsia="Arial" w:hAnsi="Arial"/>
-          <w:b/>
-          <w:bCs/>
-          <w:color w:val="1F4F99"/>
-          <w:spacing w:val="10"/>
-          <w:sz w:val="21"/>
-          <w:szCs w:val="21"/>
-        </w:rPr>
-        <w:t xml:space="preserve">PROJECTS</w:t>
-      </w:r>
-    </w:p>
-    <w:p>
-      <w:pPr>
-        <w:spacing w:after="20" w:before="120"/>
-      </w:pPr>
-      <w:r>
-        <w:rPr>
-          <w:rFonts w:ascii="Arial" w:cs="Arial" w:eastAsia="Arial" w:hAnsi="Arial"/>
-          <w:b/>
-          <w:bCs/>
-          <w:sz w:val="22"/>
-          <w:szCs w:val="22"/>
-        </w:rPr>
-        <w:t xml:space="preserve">Sentinel-Pi — Real-Time Person Detection on Raspberry Pi</w:t>
+        <w:t xml:space="preserve">Built an air-quality and gas monitoring device on ESP32-S3 (C++, FreeRTOS; AI-assisted development): four sensors read over UART and ADC, dual-core tasks, and mutex-protected shared data.</w:t>
       </w:r>
     </w:p>
     <w:p>
@@ -384,7 +348,7 @@
           <w:sz w:val="21"/>
           <w:szCs w:val="21"/>
         </w:rPr>
-        <w:t xml:space="preserve">Lightweight person-detection system built around YOLO inference and low-latency web streaming, optimized for the Raspberry Pi 3B+.</w:t>
+        <w:t xml:space="preserve">Added network fallback (W5500 Ethernet, WiFi, then access point) that sends JSON readings to a Django REST backend, plus a flash (SPIFFS) buffering module for offline data.</w:t>
       </w:r>
     </w:p>
     <w:p>
@@ -402,7 +366,28 @@
           <w:sz w:val="21"/>
           <w:szCs w:val="21"/>
         </w:rPr>
-        <w:t xml:space="preserve">Directly tackled the core edge-AI trade-off between inference speed, accuracy, and memory footprint.</w:t>
+        <w:t xml:space="preserve">Added device authentication, rate limiting, and request and security logging (device and backend).</w:t>
+      </w:r>
+    </w:p>
+    <w:p>
+      <w:pPr>
+        <w:pStyle w:val="Heading2"/>
+        <w:pBdr>
+          <w:bottom w:val="single" w:color="1F4F99" w:sz="8" w:space="2"/>
+        </w:pBdr>
+        <w:spacing w:after="60" w:before="150"/>
+      </w:pPr>
+      <w:r>
+        <w:rPr>
+          <w:rFonts w:ascii="Arial" w:cs="Arial" w:eastAsia="Arial" w:hAnsi="Arial"/>
+          <w:b/>
+          <w:bCs/>
+          <w:color w:val="1F4F99"/>
+          <w:spacing w:val="10"/>
+          <w:sz w:val="21"/>
+          <w:szCs w:val="21"/>
+        </w:rPr>
+        <w:t xml:space="preserve">PROJECTS</w:t>
       </w:r>
     </w:p>
     <w:p>
@@ -417,7 +402,7 @@
           <w:sz w:val="22"/>
           <w:szCs w:val="22"/>
         </w:rPr>
-        <w:t xml:space="preserve">Morphology-based Brain Tumor Segmentation</w:t>
+        <w:t xml:space="preserve">Sentinel-Pi — Real-Time Person Detection on Raspberry Pi</w:t>
       </w:r>
     </w:p>
     <w:p>
@@ -435,6 +420,39 @@
           <w:sz w:val="21"/>
           <w:szCs w:val="21"/>
         </w:rPr>
+        <w:t xml:space="preserve">Lightweight person-detection system using YOLO inference and low-latency web streaming, tuned for the Raspberry Pi 3B+ (speed, accuracy, and memory trade-offs).</w:t>
+      </w:r>
+    </w:p>
+    <w:p>
+      <w:pPr>
+        <w:spacing w:after="20" w:before="120"/>
+      </w:pPr>
+      <w:r>
+        <w:rPr>
+          <w:rFonts w:ascii="Arial" w:cs="Arial" w:eastAsia="Arial" w:hAnsi="Arial"/>
+          <w:b/>
+          <w:bCs/>
+          <w:sz w:val="22"/>
+          <w:szCs w:val="22"/>
+        </w:rPr>
+        <w:t xml:space="preserve">Morphology-based Brain Tumor Segmentation</w:t>
+      </w:r>
+    </w:p>
+    <w:p>
+      <w:pPr>
+        <w:pStyle w:val="ListParagraph"/>
+        <w:numPr>
+          <w:ilvl w:val="0"/>
+          <w:numId w:val="1"/>
+        </w:numPr>
+        <w:spacing w:after="40"/>
+      </w:pPr>
+      <w:r>
+        <w:rPr>
+          <w:rFonts w:ascii="Arial" w:cs="Arial" w:eastAsia="Arial" w:hAnsi="Arial"/>
+          <w:sz w:val="21"/>
+          <w:szCs w:val="21"/>
+        </w:rPr>
         <w:t xml:space="preserve">Segmented tumors in FLAIR MRI using only classical morphology: top-hat filtering to remove the skull, then thresholding and connected-component analysis. No deep model required.</w:t>
       </w:r>
     </w:p>
@@ -442,7 +460,7 @@
       <w:pPr>
         <w:spacing w:after="60"/>
       </w:pPr>
-      <w:hyperlink w:history="1" r:id="rIdnoo0ytyhymxv9dhtz5ven">
+      <w:hyperlink w:history="1" r:id="rIdfocyzmmvfrcb02uc6lojs">
         <w:r>
           <w:rPr>
             <w:rFonts w:ascii="Arial" w:cs="Arial" w:eastAsia="Arial" w:hAnsi="Arial"/>
@@ -501,7 +519,7 @@
           <w:sz w:val="19"/>
           <w:szCs w:val="19"/>
         </w:rPr>
-        <w:t xml:space="preserve">Additional projects (SIFT feature-matching tutorial, genetic-algorithm experiments, an RL agent for Breakout, and more) are available at github.com/mortezapourhoseini.</w:t>
+        <w:t xml:space="preserve">More projects (SIFT tutorial, genetic algorithms, a Breakout RL agent) at github.com/mortezapourhoseini.</w:t>
       </w:r>
     </w:p>
     <w:p>
@@ -639,7 +657,7 @@
           <w:sz w:val="21"/>
           <w:szCs w:val="21"/>
         </w:rPr>
-        <w:t xml:space="preserve">Top performer, regional Computer Engineering Olympiad — qualified for the national stage (2025).</w:t>
+        <w:t xml:space="preserve">39th place, National Computer Engineering Olympiad (2025); top performer at the regional stage.</w:t>
       </w:r>
     </w:p>
     <w:p>
@@ -657,24 +675,6 @@
           <w:sz w:val="21"/>
           <w:szCs w:val="21"/>
         </w:rPr>
-        <w:t xml:space="preserve">39th place, National Computer Engineering Olympiad (2025).</w:t>
-      </w:r>
-    </w:p>
-    <w:p>
-      <w:pPr>
-        <w:pStyle w:val="ListParagraph"/>
-        <w:numPr>
-          <w:ilvl w:val="0"/>
-          <w:numId w:val="1"/>
-        </w:numPr>
-        <w:spacing w:after="40"/>
-      </w:pPr>
-      <w:r>
-        <w:rPr>
-          <w:rFonts w:ascii="Arial" w:cs="Arial" w:eastAsia="Arial" w:hAnsi="Arial"/>
-          <w:sz w:val="21"/>
-          <w:szCs w:val="21"/>
-        </w:rPr>
         <w:t xml:space="preserve">Completed Harvard's CS50x (Introduction to Computer Science).</w:t>
       </w:r>
     </w:p>
@@ -714,7 +714,7 @@
     </w:p>
     <w:sectPr>
       <w:pgSz w:w="12240" w:h="15840" w:orient="portrait"/>
-      <w:pgMar w:top="460" w:right="720" w:bottom="460" w:left="720" w:header="708" w:footer="708" w:gutter="0"/>
+      <w:pgMar w:top="400" w:right="720" w:bottom="380" w:left="720" w:header="708" w:footer="708" w:gutter="0"/>
       <w:pgNumType/>
       <w:docGrid w:linePitch="360"/>
     </w:sectPr>

</xml_diff>